<commit_message>
feat: add sk-yayasan-guru.docx template to public directory
</commit_message>
<xml_diff>
--- a/public/templates/sk-yayasan-guru.docx
+++ b/public/templates/sk-yayasan-guru.docx
@@ -1363,25 +1363,7 @@
                 <w:sz w:val="24"/>
                 <w:szCs w:val="24"/>
               </w:rPr>
-              <w:t xml:space="preserve"> </w:t>
-            </w:r>
-            <w:proofErr w:type="spellStart"/>
-            <w:r>
-              <w:rPr>
-                <w:rFonts w:ascii="Bookman Old Style" w:hAnsi="Bookman Old Style"/>
-                <w:sz w:val="24"/>
-                <w:szCs w:val="24"/>
-              </w:rPr>
-              <w:t>Nahdlatul</w:t>
-            </w:r>
-            <w:proofErr w:type="spellEnd"/>
-            <w:r>
-              <w:rPr>
-                <w:rFonts w:ascii="Bookman Old Style" w:hAnsi="Bookman Old Style"/>
-                <w:sz w:val="24"/>
-                <w:szCs w:val="24"/>
-              </w:rPr>
-              <w:t xml:space="preserve"> Wathan Penyenggir </w:t>
+              <w:t xml:space="preserve"> Nahdlatul Wathan Penyenggir </w:t>
             </w:r>
             <w:proofErr w:type="spellStart"/>
             <w:r>
@@ -1666,43 +1648,7 @@
                 <w:sz w:val="24"/>
                 <w:szCs w:val="24"/>
               </w:rPr>
-              <w:t xml:space="preserve"> </w:t>
-            </w:r>
-            <w:proofErr w:type="spellStart"/>
-            <w:r>
-              <w:rPr>
-                <w:rFonts w:ascii="Bookman Old Style" w:hAnsi="Bookman Old Style"/>
-                <w:sz w:val="24"/>
-                <w:szCs w:val="24"/>
-              </w:rPr>
-              <w:t>Pengurus</w:t>
-            </w:r>
-            <w:proofErr w:type="spellEnd"/>
-            <w:r>
-              <w:rPr>
-                <w:rFonts w:ascii="Bookman Old Style" w:hAnsi="Bookman Old Style"/>
-                <w:sz w:val="24"/>
-                <w:szCs w:val="24"/>
-              </w:rPr>
-              <w:t xml:space="preserve"> Yayasan </w:t>
-            </w:r>
-            <w:proofErr w:type="spellStart"/>
-            <w:r>
-              <w:rPr>
-                <w:rFonts w:ascii="Bookman Old Style" w:hAnsi="Bookman Old Style"/>
-                <w:sz w:val="24"/>
-                <w:szCs w:val="24"/>
-              </w:rPr>
-              <w:t>Pondok</w:t>
-            </w:r>
-            <w:proofErr w:type="spellEnd"/>
-            <w:r>
-              <w:rPr>
-                <w:rFonts w:ascii="Bookman Old Style" w:hAnsi="Bookman Old Style"/>
-                <w:sz w:val="24"/>
-                <w:szCs w:val="24"/>
-              </w:rPr>
-              <w:t xml:space="preserve"> </w:t>
+              <w:t xml:space="preserve"> Pengurus Yayasan Pondok </w:t>
             </w:r>
             <w:proofErr w:type="spellStart"/>
             <w:r>
@@ -2314,7 +2260,25 @@
                 <w:sz w:val="24"/>
                 <w:szCs w:val="24"/>
               </w:rPr>
-              <w:t xml:space="preserve"> Pemerintah RI No. 57 </w:t>
+              <w:t xml:space="preserve"> </w:t>
+            </w:r>
+            <w:proofErr w:type="spellStart"/>
+            <w:r>
+              <w:rPr>
+                <w:rFonts w:ascii="Bookman Old Style" w:hAnsi="Bookman Old Style"/>
+                <w:sz w:val="24"/>
+                <w:szCs w:val="24"/>
+              </w:rPr>
+              <w:t>Pemerintah</w:t>
+            </w:r>
+            <w:proofErr w:type="spellEnd"/>
+            <w:r>
+              <w:rPr>
+                <w:rFonts w:ascii="Bookman Old Style" w:hAnsi="Bookman Old Style"/>
+                <w:sz w:val="24"/>
+                <w:szCs w:val="24"/>
+              </w:rPr>
+              <w:t xml:space="preserve"> RI No. 57 </w:t>
             </w:r>
             <w:proofErr w:type="spellStart"/>
             <w:r>
@@ -2864,7 +2828,25 @@
                 <w:szCs w:val="24"/>
                 <w:lang w:val="sv-SE"/>
               </w:rPr>
-              <w:t>{nama}</w:t>
+              <w:t>{nama</w:t>
+            </w:r>
+            <w:r>
+              <w:rPr>
+                <w:rFonts w:ascii="Bookman Old Style" w:hAnsi="Bookman Old Style"/>
+                <w:sz w:val="24"/>
+                <w:szCs w:val="24"/>
+                <w:lang w:val="sv-SE"/>
+              </w:rPr>
+              <w:t xml:space="preserve"> guru</w:t>
+            </w:r>
+            <w:r>
+              <w:rPr>
+                <w:rFonts w:ascii="Bookman Old Style" w:hAnsi="Bookman Old Style"/>
+                <w:sz w:val="24"/>
+                <w:szCs w:val="24"/>
+                <w:lang w:val="sv-SE"/>
+              </w:rPr>
+              <w:t>}</w:t>
             </w:r>
           </w:p>
         </w:tc>

</xml_diff>